<commit_message>
Templates: use supplied ISMS documents and policies, standard Document History
Replaces 18 templates with the supplied ISMS documents and policies (company names, personal
names and platform references removed, process content unchanged), adds the Management Review
and Corrective Action procedures, and gives every template the same Document History table
at the end of the document.

Co-Authored-By: Claude Opus 5.5 <noreply@anthropic.com>
Claude-Session: https://claude.ai/code/session_01DQ8ZSi2UY9xjrq8oz1Heak
</commit_message>
<xml_diff>
--- a/netlify/template-files/access-review-plan.docx
+++ b/netlify/template-files/access-review-plan.docx
@@ -21,181 +21,13 @@
       </w:r>
     </w:p>
     <w:p>
-      <w:pPr>
-        <w:pStyle w:val="Heading1"/>
-      </w:pPr>
       <w:r>
-        <w:t>Document control</w:t>
+        <w:rPr>
+          <w:i/>
+        </w:rPr>
+        <w:t>Owner: [Role]   |   Approver: [Role]   |   Classification: Internal</w:t>
       </w:r>
     </w:p>
-    <w:tbl>
-      <w:tblPr>
-        <w:tblStyle w:val="TableGrid"/>
-        <w:tblW w:type="auto" w:w="0"/>
-        <w:tblLook w:firstColumn="1" w:firstRow="1" w:lastColumn="0" w:lastRow="0" w:noHBand="0" w:noVBand="1" w:val="04A0"/>
-      </w:tblPr>
-      <w:tblGrid>
-        <w:gridCol w:w="4873"/>
-        <w:gridCol w:w="4873"/>
-      </w:tblGrid>
-      <w:tr>
-        <w:tc>
-          <w:tcPr>
-            <w:tcW w:type="dxa" w:w="4873"/>
-            <w:shd w:val="clear" w:color="auto" w:fill="EDE9FE"/>
-          </w:tcPr>
-          <w:p>
-            <w:r>
-              <w:rPr>
-                <w:b/>
-              </w:rPr>
-              <w:t>Version</w:t>
-            </w:r>
-          </w:p>
-        </w:tc>
-        <w:tc>
-          <w:tcPr>
-            <w:tcW w:type="dxa" w:w="4873"/>
-          </w:tcPr>
-          <w:p>
-            <w:r>
-              <w:t>[x.x]</w:t>
-            </w:r>
-          </w:p>
-        </w:tc>
-      </w:tr>
-      <w:tr>
-        <w:tc>
-          <w:tcPr>
-            <w:tcW w:type="dxa" w:w="4873"/>
-            <w:shd w:val="clear" w:color="auto" w:fill="EDE9FE"/>
-          </w:tcPr>
-          <w:p>
-            <w:r>
-              <w:rPr>
-                <w:b/>
-              </w:rPr>
-              <w:t>Document owner</w:t>
-            </w:r>
-          </w:p>
-        </w:tc>
-        <w:tc>
-          <w:tcPr>
-            <w:tcW w:type="dxa" w:w="4873"/>
-          </w:tcPr>
-          <w:p>
-            <w:r>
-              <w:t>[Role]</w:t>
-            </w:r>
-          </w:p>
-        </w:tc>
-      </w:tr>
-      <w:tr>
-        <w:tc>
-          <w:tcPr>
-            <w:tcW w:type="dxa" w:w="4873"/>
-            <w:shd w:val="clear" w:color="auto" w:fill="EDE9FE"/>
-          </w:tcPr>
-          <w:p>
-            <w:r>
-              <w:rPr>
-                <w:b/>
-              </w:rPr>
-              <w:t>Approver</w:t>
-            </w:r>
-          </w:p>
-        </w:tc>
-        <w:tc>
-          <w:tcPr>
-            <w:tcW w:type="dxa" w:w="4873"/>
-          </w:tcPr>
-          <w:p>
-            <w:r>
-              <w:t>[Role]</w:t>
-            </w:r>
-          </w:p>
-        </w:tc>
-      </w:tr>
-      <w:tr>
-        <w:tc>
-          <w:tcPr>
-            <w:tcW w:type="dxa" w:w="4873"/>
-            <w:shd w:val="clear" w:color="auto" w:fill="EDE9FE"/>
-          </w:tcPr>
-          <w:p>
-            <w:r>
-              <w:rPr>
-                <w:b/>
-              </w:rPr>
-              <w:t>Effective date</w:t>
-            </w:r>
-          </w:p>
-        </w:tc>
-        <w:tc>
-          <w:tcPr>
-            <w:tcW w:type="dxa" w:w="4873"/>
-          </w:tcPr>
-          <w:p>
-            <w:r>
-              <w:t>[YYYY-MM-DD]</w:t>
-            </w:r>
-          </w:p>
-        </w:tc>
-      </w:tr>
-      <w:tr>
-        <w:tc>
-          <w:tcPr>
-            <w:tcW w:type="dxa" w:w="4873"/>
-            <w:shd w:val="clear" w:color="auto" w:fill="EDE9FE"/>
-          </w:tcPr>
-          <w:p>
-            <w:r>
-              <w:rPr>
-                <w:b/>
-              </w:rPr>
-              <w:t>Next review date</w:t>
-            </w:r>
-          </w:p>
-        </w:tc>
-        <w:tc>
-          <w:tcPr>
-            <w:tcW w:type="dxa" w:w="4873"/>
-          </w:tcPr>
-          <w:p>
-            <w:r>
-              <w:t>[YYYY-MM-DD]</w:t>
-            </w:r>
-          </w:p>
-        </w:tc>
-      </w:tr>
-      <w:tr>
-        <w:tc>
-          <w:tcPr>
-            <w:tcW w:type="dxa" w:w="4873"/>
-            <w:shd w:val="clear" w:color="auto" w:fill="EDE9FE"/>
-          </w:tcPr>
-          <w:p>
-            <w:r>
-              <w:rPr>
-                <w:b/>
-              </w:rPr>
-              <w:t>Classification</w:t>
-            </w:r>
-          </w:p>
-        </w:tc>
-        <w:tc>
-          <w:tcPr>
-            <w:tcW w:type="dxa" w:w="4873"/>
-          </w:tcPr>
-          <w:p>
-            <w:r>
-              <w:t>Internal</w:t>
-            </w:r>
-          </w:p>
-        </w:tc>
-      </w:tr>
-    </w:tbl>
-    <w:p/>
     <w:p>
       <w:pPr>
         <w:pStyle w:val="Heading1"/>
@@ -1021,10 +853,10 @@
     <w:p/>
     <w:p>
       <w:pPr>
-        <w:pStyle w:val="Heading1"/>
+        <w:pStyle w:val="Heading2"/>
       </w:pPr>
       <w:r>
-        <w:t>9. Review and approval</w:t>
+        <w:t>Document History</w:t>
       </w:r>
     </w:p>
     <w:tbl>
@@ -1034,73 +866,80 @@
         <w:tblLook w:firstColumn="1" w:firstRow="1" w:lastColumn="0" w:lastRow="0" w:noHBand="0" w:noVBand="1" w:val="04A0"/>
       </w:tblPr>
       <w:tblGrid>
-        <w:gridCol w:w="2436"/>
-        <w:gridCol w:w="2436"/>
-        <w:gridCol w:w="2436"/>
-        <w:gridCol w:w="2436"/>
+        <w:gridCol w:w="1949"/>
+        <w:gridCol w:w="1949"/>
+        <w:gridCol w:w="1949"/>
+        <w:gridCol w:w="1949"/>
+        <w:gridCol w:w="1949"/>
       </w:tblGrid>
       <w:tr>
         <w:tc>
           <w:tcPr>
-            <w:tcW w:type="dxa" w:w="2436"/>
-            <w:shd w:val="clear" w:color="auto" w:fill="5B21B6"/>
+            <w:tcW w:type="dxa" w:w="1949"/>
+            <w:shd w:val="clear" w:color="auto" w:fill="EDE9FE"/>
           </w:tcPr>
           <w:p>
             <w:r>
               <w:rPr>
                 <w:b/>
-                <w:color w:val="FFFFFF"/>
-                <w:sz w:val="19"/>
               </w:rPr>
-              <w:t>Role</w:t>
+              <w:t>Version</w:t>
             </w:r>
           </w:p>
         </w:tc>
         <w:tc>
           <w:tcPr>
-            <w:tcW w:type="dxa" w:w="2436"/>
-            <w:shd w:val="clear" w:color="auto" w:fill="5B21B6"/>
+            <w:tcW w:type="dxa" w:w="1949"/>
+            <w:shd w:val="clear" w:color="auto" w:fill="EDE9FE"/>
           </w:tcPr>
           <w:p>
             <w:r>
               <w:rPr>
                 <w:b/>
-                <w:color w:val="FFFFFF"/>
-                <w:sz w:val="19"/>
               </w:rPr>
-              <w:t>Name</w:t>
+              <w:t>Date</w:t>
             </w:r>
           </w:p>
         </w:tc>
         <w:tc>
           <w:tcPr>
-            <w:tcW w:type="dxa" w:w="2436"/>
-            <w:shd w:val="clear" w:color="auto" w:fill="5B21B6"/>
+            <w:tcW w:type="dxa" w:w="1949"/>
+            <w:shd w:val="clear" w:color="auto" w:fill="EDE9FE"/>
           </w:tcPr>
           <w:p>
             <w:r>
               <w:rPr>
                 <w:b/>
-                <w:color w:val="FFFFFF"/>
-                <w:sz w:val="19"/>
               </w:rPr>
-              <w:t>Signature</w:t>
+              <w:t>Description</w:t>
             </w:r>
           </w:p>
         </w:tc>
         <w:tc>
           <w:tcPr>
-            <w:tcW w:type="dxa" w:w="2436"/>
-            <w:shd w:val="clear" w:color="auto" w:fill="5B21B6"/>
+            <w:tcW w:type="dxa" w:w="1949"/>
+            <w:shd w:val="clear" w:color="auto" w:fill="EDE9FE"/>
           </w:tcPr>
           <w:p>
             <w:r>
               <w:rPr>
                 <w:b/>
-                <w:color w:val="FFFFFF"/>
-                <w:sz w:val="19"/>
               </w:rPr>
-              <w:t>Date</w:t>
+              <w:t>Written by</w:t>
+            </w:r>
+          </w:p>
+        </w:tc>
+        <w:tc>
+          <w:tcPr>
+            <w:tcW w:type="dxa" w:w="1949"/>
+            <w:shd w:val="clear" w:color="auto" w:fill="EDE9FE"/>
+          </w:tcPr>
+          <w:p>
+            <w:r>
+              <w:rPr>
+                <w:b/>
+              </w:rPr>
+              <w:t>Approved by</w:t>
             </w:r>
           </w:p>
         </w:tc>
@@ -1108,243 +947,56 @@
       <w:tr>
         <w:tc>
           <w:tcPr>
-            <w:tcW w:type="dxa" w:w="2436"/>
+            <w:tcW w:type="dxa" w:w="1949"/>
           </w:tcPr>
           <w:p>
             <w:r>
-              <w:t>Prepared by</w:t>
+              <w:t>1.0.0</w:t>
             </w:r>
           </w:p>
         </w:tc>
         <w:tc>
           <w:tcPr>
-            <w:tcW w:type="dxa" w:w="2436"/>
-          </w:tcPr>
-          <w:p>
-            <w:r/>
-          </w:p>
-        </w:tc>
-        <w:tc>
-          <w:tcPr>
-            <w:tcW w:type="dxa" w:w="2436"/>
-          </w:tcPr>
-          <w:p>
-            <w:r/>
-          </w:p>
-        </w:tc>
-        <w:tc>
-          <w:tcPr>
-            <w:tcW w:type="dxa" w:w="2436"/>
-          </w:tcPr>
-          <w:p>
-            <w:r/>
-          </w:p>
-        </w:tc>
-      </w:tr>
-      <w:tr>
-        <w:tc>
-          <w:tcPr>
-            <w:tcW w:type="dxa" w:w="2436"/>
+            <w:tcW w:type="dxa" w:w="1949"/>
           </w:tcPr>
           <w:p>
             <w:r>
-              <w:t>Reviewed by</w:t>
+              <w:t>[TODAYS DATE]</w:t>
             </w:r>
           </w:p>
         </w:tc>
         <w:tc>
           <w:tcPr>
-            <w:tcW w:type="dxa" w:w="2436"/>
-          </w:tcPr>
-          <w:p>
-            <w:r/>
-          </w:p>
-        </w:tc>
-        <w:tc>
-          <w:tcPr>
-            <w:tcW w:type="dxa" w:w="2436"/>
-          </w:tcPr>
-          <w:p>
-            <w:r/>
-          </w:p>
-        </w:tc>
-        <w:tc>
-          <w:tcPr>
-            <w:tcW w:type="dxa" w:w="2436"/>
-          </w:tcPr>
-          <w:p>
-            <w:r/>
-          </w:p>
-        </w:tc>
-      </w:tr>
-      <w:tr>
-        <w:tc>
-          <w:tcPr>
-            <w:tcW w:type="dxa" w:w="2436"/>
+            <w:tcW w:type="dxa" w:w="1949"/>
           </w:tcPr>
           <w:p>
             <w:r>
-              <w:t>Approved by</w:t>
+              <w:t>Initial Version</w:t>
             </w:r>
           </w:p>
         </w:tc>
         <w:tc>
           <w:tcPr>
-            <w:tcW w:type="dxa" w:w="2436"/>
-          </w:tcPr>
-          <w:p>
-            <w:r/>
-          </w:p>
-        </w:tc>
-        <w:tc>
-          <w:tcPr>
-            <w:tcW w:type="dxa" w:w="2436"/>
-          </w:tcPr>
-          <w:p>
-            <w:r/>
-          </w:p>
-        </w:tc>
-        <w:tc>
-          <w:tcPr>
-            <w:tcW w:type="dxa" w:w="2436"/>
-          </w:tcPr>
-          <w:p>
-            <w:r/>
-          </w:p>
-        </w:tc>
-      </w:tr>
-    </w:tbl>
-    <w:p/>
-    <w:p>
-      <w:r>
-        <w:rPr>
-          <w:b/>
-        </w:rPr>
-        <w:t>Revision history</w:t>
-      </w:r>
-    </w:p>
-    <w:tbl>
-      <w:tblPr>
-        <w:tblStyle w:val="TableGrid"/>
-        <w:tblW w:type="auto" w:w="0"/>
-        <w:tblLook w:firstColumn="1" w:firstRow="1" w:lastColumn="0" w:lastRow="0" w:noHBand="0" w:noVBand="1" w:val="04A0"/>
-      </w:tblPr>
-      <w:tblGrid>
-        <w:gridCol w:w="2436"/>
-        <w:gridCol w:w="2436"/>
-        <w:gridCol w:w="2436"/>
-        <w:gridCol w:w="2436"/>
-      </w:tblGrid>
-      <w:tr>
-        <w:tc>
-          <w:tcPr>
-            <w:tcW w:type="dxa" w:w="2436"/>
-            <w:shd w:val="clear" w:color="auto" w:fill="5B21B6"/>
+            <w:tcW w:type="dxa" w:w="1949"/>
           </w:tcPr>
           <w:p>
             <w:r>
-              <w:rPr>
-                <w:b/>
-                <w:color w:val="FFFFFF"/>
-                <w:sz w:val="19"/>
-              </w:rPr>
-              <w:t>Version</w:t>
+              <w:t>[Name]</w:t>
             </w:r>
           </w:p>
         </w:tc>
         <w:tc>
           <w:tcPr>
-            <w:tcW w:type="dxa" w:w="2436"/>
-            <w:shd w:val="clear" w:color="auto" w:fill="5B21B6"/>
+            <w:tcW w:type="dxa" w:w="1949"/>
           </w:tcPr>
           <w:p>
             <w:r>
-              <w:rPr>
-                <w:b/>
-                <w:color w:val="FFFFFF"/>
-                <w:sz w:val="19"/>
-              </w:rPr>
-              <w:t>Date</w:t>
-            </w:r>
-          </w:p>
-        </w:tc>
-        <w:tc>
-          <w:tcPr>
-            <w:tcW w:type="dxa" w:w="2436"/>
-            <w:shd w:val="clear" w:color="auto" w:fill="5B21B6"/>
-          </w:tcPr>
-          <w:p>
-            <w:r>
-              <w:rPr>
-                <w:b/>
-                <w:color w:val="FFFFFF"/>
-                <w:sz w:val="19"/>
-              </w:rPr>
-              <w:t>Author</w:t>
-            </w:r>
-          </w:p>
-        </w:tc>
-        <w:tc>
-          <w:tcPr>
-            <w:tcW w:type="dxa" w:w="2436"/>
-            <w:shd w:val="clear" w:color="auto" w:fill="5B21B6"/>
-          </w:tcPr>
-          <w:p>
-            <w:r>
-              <w:rPr>
-                <w:b/>
-                <w:color w:val="FFFFFF"/>
-                <w:sz w:val="19"/>
-              </w:rPr>
-              <w:t>Description of change</w:t>
-            </w:r>
-          </w:p>
-        </w:tc>
-      </w:tr>
-      <w:tr>
-        <w:tc>
-          <w:tcPr>
-            <w:tcW w:type="dxa" w:w="2436"/>
-          </w:tcPr>
-          <w:p>
-            <w:r>
-              <w:t>1.0</w:t>
-            </w:r>
-          </w:p>
-        </w:tc>
-        <w:tc>
-          <w:tcPr>
-            <w:tcW w:type="dxa" w:w="2436"/>
-          </w:tcPr>
-          <w:p>
-            <w:r>
-              <w:t>[YYYY-MM-DD]</w:t>
-            </w:r>
-          </w:p>
-        </w:tc>
-        <w:tc>
-          <w:tcPr>
-            <w:tcW w:type="dxa" w:w="2436"/>
-          </w:tcPr>
-          <w:p>
-            <w:r>
-              <w:t>[Role]</w:t>
-            </w:r>
-          </w:p>
-        </w:tc>
-        <w:tc>
-          <w:tcPr>
-            <w:tcW w:type="dxa" w:w="2436"/>
-          </w:tcPr>
-          <w:p>
-            <w:r>
-              <w:t>Initial version</w:t>
+              <w:t>[Name]</w:t>
             </w:r>
           </w:p>
         </w:tc>
       </w:tr>
     </w:tbl>
-    <w:p/>
     <w:sectPr>
       <w:footerReference w:type="default" r:id="rId9"/>
       <w:pgSz w:w="12240" w:h="15840"/>

</xml_diff>